<commit_message>
Phase 2 - Requirements
</commit_message>
<xml_diff>
--- a/Phase 1 - Orientation/ProjectPlan-M.Constantin.docx
+++ b/Phase 1 - Orientation/ProjectPlan-M.Constantin.docx
@@ -86,15 +86,14 @@
         <w:rPr>
           <w:b/>
           <w:sz w:val="72"/>
-          <w:lang w:val="en-GB"/>
         </w:rPr>
       </w:pPr>
       <w:bookmarkStart w:id="0" w:name="_Toc327581040"/>
+      <w:proofErr w:type="gramStart"/>
       <w:r>
         <w:rPr>
           <w:b/>
           <w:sz w:val="72"/>
-          <w:lang w:val="en-GB"/>
         </w:rPr>
         <w:t>Project</w:t>
       </w:r>
@@ -102,7 +101,6 @@
         <w:rPr>
           <w:b/>
           <w:sz w:val="72"/>
-          <w:lang w:val="en-GB"/>
         </w:rPr>
         <w:t xml:space="preserve"> </w:t>
       </w:r>
@@ -110,25 +108,18 @@
         <w:rPr>
           <w:b/>
           <w:sz w:val="72"/>
-          <w:lang w:val="en-GB"/>
         </w:rPr>
         <w:t>plan</w:t>
       </w:r>
       <w:bookmarkEnd w:id="0"/>
-    </w:p>
-    <w:p>
-      <w:pPr>
-        <w:rPr>
-          <w:lang w:val="en-GB"/>
-        </w:rPr>
-      </w:pPr>
-    </w:p>
+      <w:proofErr w:type="gramEnd"/>
+    </w:p>
+    <w:p/>
     <w:p>
       <w:pPr>
         <w:jc w:val="center"/>
         <w:rPr>
           <w:i/>
-          <w:lang w:val="en-GB"/>
         </w:rPr>
       </w:pPr>
       <w:bookmarkStart w:id="1" w:name="_Toc327581041"/>
@@ -137,7 +128,6 @@
           <w:b/>
           <w:i/>
           <w:sz w:val="52"/>
-          <w:lang w:val="en-GB"/>
         </w:rPr>
         <w:t>LLM Hosting</w:t>
       </w:r>
@@ -148,7 +138,6 @@
         <w:jc w:val="center"/>
         <w:rPr>
           <w:i/>
-          <w:lang w:val="en-GB"/>
         </w:rPr>
       </w:pPr>
     </w:p>
@@ -156,7 +145,6 @@
       <w:pPr>
         <w:rPr>
           <w:i/>
-          <w:lang w:val="en-GB"/>
         </w:rPr>
       </w:pPr>
     </w:p>
@@ -167,7 +155,6 @@
         <w:rPr>
           <w:i/>
           <w:sz w:val="52"/>
-          <w:lang w:val="en-GB"/>
         </w:rPr>
       </w:pPr>
       <w:bookmarkStart w:id="2" w:name="Plaats"/>
@@ -176,7 +163,6 @@
         <w:rPr>
           <w:i/>
           <w:sz w:val="52"/>
-          <w:lang w:val="en-GB"/>
         </w:rPr>
         <w:t>Nahayat</w:t>
       </w:r>
@@ -186,9 +172,6 @@
     <w:p>
       <w:pPr>
         <w:jc w:val="center"/>
-        <w:rPr>
-          <w:lang w:val="en-GB"/>
-        </w:rPr>
       </w:pPr>
       <w:proofErr w:type="spellStart"/>
       <w:proofErr w:type="gramStart"/>
@@ -197,7 +180,6 @@
           <w:b/>
           <w:i/>
           <w:sz w:val="28"/>
-          <w:lang w:val="en-GB"/>
         </w:rPr>
         <w:t>Oisterwijk</w:t>
       </w:r>
@@ -206,110 +188,35 @@
           <w:b/>
           <w:i/>
           <w:sz w:val="28"/>
-          <w:lang w:val="en-GB"/>
         </w:rPr>
         <w:t>,Netherlands</w:t>
       </w:r>
       <w:proofErr w:type="spellEnd"/>
       <w:proofErr w:type="gramEnd"/>
     </w:p>
-    <w:p>
-      <w:pPr>
-        <w:rPr>
-          <w:lang w:val="en-GB"/>
-        </w:rPr>
-      </w:pPr>
-    </w:p>
-    <w:p>
-      <w:pPr>
-        <w:rPr>
-          <w:lang w:val="en-GB"/>
-        </w:rPr>
-      </w:pPr>
-    </w:p>
-    <w:p>
-      <w:pPr>
-        <w:rPr>
-          <w:lang w:val="en-GB"/>
-        </w:rPr>
-      </w:pPr>
-    </w:p>
-    <w:p>
-      <w:pPr>
-        <w:rPr>
-          <w:lang w:val="en-GB"/>
-        </w:rPr>
-      </w:pPr>
-    </w:p>
-    <w:p>
-      <w:pPr>
-        <w:rPr>
-          <w:lang w:val="en-GB"/>
-        </w:rPr>
-      </w:pPr>
-    </w:p>
-    <w:p>
-      <w:pPr>
-        <w:rPr>
-          <w:lang w:val="en-GB"/>
-        </w:rPr>
-      </w:pPr>
-    </w:p>
-    <w:p>
-      <w:pPr>
-        <w:rPr>
-          <w:lang w:val="en-GB"/>
-        </w:rPr>
-      </w:pPr>
-    </w:p>
-    <w:p>
-      <w:pPr>
-        <w:rPr>
-          <w:lang w:val="en-GB"/>
-        </w:rPr>
-      </w:pPr>
-    </w:p>
-    <w:p>
-      <w:pPr>
-        <w:rPr>
-          <w:lang w:val="en-GB"/>
-        </w:rPr>
-      </w:pPr>
-    </w:p>
-    <w:p>
-      <w:pPr>
-        <w:rPr>
-          <w:lang w:val="en-GB"/>
-        </w:rPr>
-      </w:pPr>
-    </w:p>
-    <w:p>
-      <w:pPr>
-        <w:rPr>
-          <w:lang w:val="en-GB"/>
-        </w:rPr>
-      </w:pPr>
-    </w:p>
-    <w:p>
-      <w:pPr>
-        <w:rPr>
-          <w:lang w:val="en-GB"/>
-        </w:rPr>
-      </w:pPr>
-    </w:p>
+    <w:p/>
+    <w:p/>
+    <w:p/>
+    <w:p/>
+    <w:p/>
+    <w:p/>
+    <w:p/>
+    <w:p/>
+    <w:p/>
+    <w:p/>
+    <w:p/>
+    <w:p/>
     <w:p>
       <w:pPr>
         <w:spacing w:after="200" w:line="276" w:lineRule="auto"/>
         <w:rPr>
           <w:iCs/>
           <w:sz w:val="22"/>
-          <w:lang w:val="en-GB"/>
         </w:rPr>
       </w:pPr>
       <w:r>
         <w:rPr>
           <w:i/>
-          <w:lang w:val="en-GB"/>
         </w:rPr>
         <w:br w:type="page"/>
       </w:r>
@@ -1637,7 +1544,7 @@
           <w:kern w:val="2"/>
           <w:sz w:val="24"/>
           <w:szCs w:val="24"/>
-          <w:lang w:val="en-NL" w:eastAsia="en-NL"/>
+          <w:lang w:val="en-US" w:eastAsia="zh-CN"/>
           <w14:ligatures w14:val="standardContextual"/>
         </w:rPr>
       </w:pPr>
@@ -1676,7 +1583,7 @@
           <w:kern w:val="2"/>
           <w:sz w:val="24"/>
           <w:szCs w:val="24"/>
-          <w:lang w:val="en-NL" w:eastAsia="en-NL"/>
+          <w:lang w:val="en-US" w:eastAsia="zh-CN"/>
           <w14:ligatures w14:val="standardContextual"/>
         </w:rPr>
         <w:tab/>
@@ -1704,7 +1611,7 @@
         <w:rPr>
           <w:noProof/>
         </w:rPr>
-        <w:instrText xml:space="preserve"> PAGEREF _Toc242267089 \h </w:instrText>
+        <w:instrText xml:space="preserve"> PAGEREF _Toc242238326 \h </w:instrText>
       </w:r>
       <w:r>
         <w:rPr>
@@ -1742,7 +1649,7 @@
           <w:kern w:val="2"/>
           <w:sz w:val="24"/>
           <w:szCs w:val="24"/>
-          <w:lang w:val="en-NL" w:eastAsia="en-NL"/>
+          <w:lang w:val="en-US" w:eastAsia="zh-CN"/>
           <w14:ligatures w14:val="standardContextual"/>
         </w:rPr>
       </w:pPr>
@@ -1767,7 +1674,7 @@
           <w:kern w:val="2"/>
           <w:sz w:val="24"/>
           <w:szCs w:val="24"/>
-          <w:lang w:val="en-NL" w:eastAsia="en-NL"/>
+          <w:lang w:val="en-US" w:eastAsia="zh-CN"/>
           <w14:ligatures w14:val="standardContextual"/>
         </w:rPr>
         <w:tab/>
@@ -1795,7 +1702,7 @@
         <w:rPr>
           <w:noProof/>
         </w:rPr>
-        <w:instrText xml:space="preserve"> PAGEREF _Toc242267090 \h </w:instrText>
+        <w:instrText xml:space="preserve"> PAGEREF _Toc242238327 \h </w:instrText>
       </w:r>
       <w:r>
         <w:rPr>
@@ -1833,7 +1740,7 @@
           <w:kern w:val="2"/>
           <w:sz w:val="24"/>
           <w:szCs w:val="24"/>
-          <w:lang w:val="en-NL" w:eastAsia="en-NL"/>
+          <w:lang w:val="en-US" w:eastAsia="zh-CN"/>
           <w14:ligatures w14:val="standardContextual"/>
         </w:rPr>
       </w:pPr>
@@ -1858,7 +1765,7 @@
           <w:kern w:val="2"/>
           <w:sz w:val="24"/>
           <w:szCs w:val="24"/>
-          <w:lang w:val="en-NL" w:eastAsia="en-NL"/>
+          <w:lang w:val="en-US" w:eastAsia="zh-CN"/>
           <w14:ligatures w14:val="standardContextual"/>
         </w:rPr>
         <w:tab/>
@@ -1886,7 +1793,7 @@
         <w:rPr>
           <w:noProof/>
         </w:rPr>
-        <w:instrText xml:space="preserve"> PAGEREF _Toc242267091 \h </w:instrText>
+        <w:instrText xml:space="preserve"> PAGEREF _Toc242238328 \h </w:instrText>
       </w:r>
       <w:r>
         <w:rPr>
@@ -1924,7 +1831,7 @@
           <w:kern w:val="2"/>
           <w:sz w:val="24"/>
           <w:szCs w:val="24"/>
-          <w:lang w:val="en-NL" w:eastAsia="en-NL"/>
+          <w:lang w:val="en-US" w:eastAsia="zh-CN"/>
           <w14:ligatures w14:val="standardContextual"/>
         </w:rPr>
       </w:pPr>
@@ -1949,7 +1856,7 @@
           <w:kern w:val="2"/>
           <w:sz w:val="24"/>
           <w:szCs w:val="24"/>
-          <w:lang w:val="en-NL" w:eastAsia="en-NL"/>
+          <w:lang w:val="en-US" w:eastAsia="zh-CN"/>
           <w14:ligatures w14:val="standardContextual"/>
         </w:rPr>
         <w:tab/>
@@ -1977,7 +1884,7 @@
         <w:rPr>
           <w:noProof/>
         </w:rPr>
-        <w:instrText xml:space="preserve"> PAGEREF _Toc242267092 \h </w:instrText>
+        <w:instrText xml:space="preserve"> PAGEREF _Toc242238329 \h </w:instrText>
       </w:r>
       <w:r>
         <w:rPr>
@@ -2015,7 +1922,7 @@
           <w:kern w:val="2"/>
           <w:sz w:val="24"/>
           <w:szCs w:val="24"/>
-          <w:lang w:val="en-NL" w:eastAsia="en-NL"/>
+          <w:lang w:val="en-US" w:eastAsia="zh-CN"/>
           <w14:ligatures w14:val="standardContextual"/>
         </w:rPr>
       </w:pPr>
@@ -2040,7 +1947,7 @@
           <w:kern w:val="2"/>
           <w:sz w:val="24"/>
           <w:szCs w:val="24"/>
-          <w:lang w:val="en-NL" w:eastAsia="en-NL"/>
+          <w:lang w:val="en-US" w:eastAsia="zh-CN"/>
           <w14:ligatures w14:val="standardContextual"/>
         </w:rPr>
         <w:tab/>
@@ -2068,7 +1975,7 @@
         <w:rPr>
           <w:noProof/>
         </w:rPr>
-        <w:instrText xml:space="preserve"> PAGEREF _Toc242267093 \h </w:instrText>
+        <w:instrText xml:space="preserve"> PAGEREF _Toc242238330 \h </w:instrText>
       </w:r>
       <w:r>
         <w:rPr>
@@ -2106,7 +2013,7 @@
           <w:kern w:val="2"/>
           <w:sz w:val="24"/>
           <w:szCs w:val="24"/>
-          <w:lang w:val="en-NL" w:eastAsia="en-NL"/>
+          <w:lang w:val="en-US" w:eastAsia="zh-CN"/>
           <w14:ligatures w14:val="standardContextual"/>
         </w:rPr>
       </w:pPr>
@@ -2131,7 +2038,7 @@
           <w:kern w:val="2"/>
           <w:sz w:val="24"/>
           <w:szCs w:val="24"/>
-          <w:lang w:val="en-NL" w:eastAsia="en-NL"/>
+          <w:lang w:val="en-US" w:eastAsia="zh-CN"/>
           <w14:ligatures w14:val="standardContextual"/>
         </w:rPr>
         <w:tab/>
@@ -2159,7 +2066,7 @@
         <w:rPr>
           <w:noProof/>
         </w:rPr>
-        <w:instrText xml:space="preserve"> PAGEREF _Toc242267094 \h </w:instrText>
+        <w:instrText xml:space="preserve"> PAGEREF _Toc242238331 \h </w:instrText>
       </w:r>
       <w:r>
         <w:rPr>
@@ -2197,7 +2104,7 @@
           <w:kern w:val="2"/>
           <w:sz w:val="24"/>
           <w:szCs w:val="24"/>
-          <w:lang w:val="en-NL" w:eastAsia="en-NL"/>
+          <w:lang w:val="en-US" w:eastAsia="zh-CN"/>
           <w14:ligatures w14:val="standardContextual"/>
         </w:rPr>
       </w:pPr>
@@ -2215,7 +2122,7 @@
           <w:kern w:val="2"/>
           <w:sz w:val="24"/>
           <w:szCs w:val="24"/>
-          <w:lang w:val="en-NL" w:eastAsia="en-NL"/>
+          <w:lang w:val="en-US" w:eastAsia="zh-CN"/>
           <w14:ligatures w14:val="standardContextual"/>
         </w:rPr>
         <w:tab/>
@@ -2243,7 +2150,7 @@
         <w:rPr>
           <w:noProof/>
         </w:rPr>
-        <w:instrText xml:space="preserve"> PAGEREF _Toc242267095 \h </w:instrText>
+        <w:instrText xml:space="preserve"> PAGEREF _Toc242238332 \h </w:instrText>
       </w:r>
       <w:r>
         <w:rPr>
@@ -2281,7 +2188,7 @@
           <w:kern w:val="2"/>
           <w:sz w:val="24"/>
           <w:szCs w:val="24"/>
-          <w:lang w:val="en-NL" w:eastAsia="en-NL"/>
+          <w:lang w:val="en-US" w:eastAsia="zh-CN"/>
           <w14:ligatures w14:val="standardContextual"/>
         </w:rPr>
       </w:pPr>
@@ -2306,7 +2213,7 @@
           <w:kern w:val="2"/>
           <w:sz w:val="24"/>
           <w:szCs w:val="24"/>
-          <w:lang w:val="en-NL" w:eastAsia="en-NL"/>
+          <w:lang w:val="en-US" w:eastAsia="zh-CN"/>
           <w14:ligatures w14:val="standardContextual"/>
         </w:rPr>
         <w:tab/>
@@ -2334,7 +2241,7 @@
         <w:rPr>
           <w:noProof/>
         </w:rPr>
-        <w:instrText xml:space="preserve"> PAGEREF _Toc242267096 \h </w:instrText>
+        <w:instrText xml:space="preserve"> PAGEREF _Toc242238333 \h </w:instrText>
       </w:r>
       <w:r>
         <w:rPr>
@@ -2372,7 +2279,7 @@
           <w:kern w:val="2"/>
           <w:sz w:val="24"/>
           <w:szCs w:val="24"/>
-          <w:lang w:val="en-NL" w:eastAsia="en-NL"/>
+          <w:lang w:val="en-US" w:eastAsia="zh-CN"/>
           <w14:ligatures w14:val="standardContextual"/>
         </w:rPr>
       </w:pPr>
@@ -2390,7 +2297,7 @@
           <w:kern w:val="2"/>
           <w:sz w:val="24"/>
           <w:szCs w:val="24"/>
-          <w:lang w:val="en-NL" w:eastAsia="en-NL"/>
+          <w:lang w:val="en-US" w:eastAsia="zh-CN"/>
           <w14:ligatures w14:val="standardContextual"/>
         </w:rPr>
         <w:tab/>
@@ -2418,7 +2325,7 @@
         <w:rPr>
           <w:noProof/>
         </w:rPr>
-        <w:instrText xml:space="preserve"> PAGEREF _Toc242267097 \h </w:instrText>
+        <w:instrText xml:space="preserve"> PAGEREF _Toc242238334 \h </w:instrText>
       </w:r>
       <w:r>
         <w:rPr>
@@ -2456,7 +2363,7 @@
           <w:kern w:val="2"/>
           <w:sz w:val="24"/>
           <w:szCs w:val="24"/>
-          <w:lang w:val="en-NL" w:eastAsia="en-NL"/>
+          <w:lang w:val="en-US" w:eastAsia="zh-CN"/>
           <w14:ligatures w14:val="standardContextual"/>
         </w:rPr>
       </w:pPr>
@@ -2481,7 +2388,7 @@
           <w:kern w:val="2"/>
           <w:sz w:val="24"/>
           <w:szCs w:val="24"/>
-          <w:lang w:val="en-NL" w:eastAsia="en-NL"/>
+          <w:lang w:val="en-US" w:eastAsia="zh-CN"/>
           <w14:ligatures w14:val="standardContextual"/>
         </w:rPr>
         <w:tab/>
@@ -2509,7 +2416,7 @@
         <w:rPr>
           <w:noProof/>
         </w:rPr>
-        <w:instrText xml:space="preserve"> PAGEREF _Toc242267098 \h </w:instrText>
+        <w:instrText xml:space="preserve"> PAGEREF _Toc242238335 \h </w:instrText>
       </w:r>
       <w:r>
         <w:rPr>
@@ -2547,7 +2454,7 @@
           <w:kern w:val="2"/>
           <w:sz w:val="24"/>
           <w:szCs w:val="24"/>
-          <w:lang w:val="en-NL" w:eastAsia="en-NL"/>
+          <w:lang w:val="en-US" w:eastAsia="zh-CN"/>
           <w14:ligatures w14:val="standardContextual"/>
         </w:rPr>
       </w:pPr>
@@ -2572,7 +2479,7 @@
           <w:kern w:val="2"/>
           <w:sz w:val="24"/>
           <w:szCs w:val="24"/>
-          <w:lang w:val="en-NL" w:eastAsia="en-NL"/>
+          <w:lang w:val="en-US" w:eastAsia="zh-CN"/>
           <w14:ligatures w14:val="standardContextual"/>
         </w:rPr>
         <w:tab/>
@@ -2600,7 +2507,7 @@
         <w:rPr>
           <w:noProof/>
         </w:rPr>
-        <w:instrText xml:space="preserve"> PAGEREF _Toc242267099 \h </w:instrText>
+        <w:instrText xml:space="preserve"> PAGEREF _Toc242238336 \h </w:instrText>
       </w:r>
       <w:r>
         <w:rPr>
@@ -2638,7 +2545,7 @@
           <w:kern w:val="2"/>
           <w:sz w:val="24"/>
           <w:szCs w:val="24"/>
-          <w:lang w:val="en-NL" w:eastAsia="en-NL"/>
+          <w:lang w:val="en-US" w:eastAsia="zh-CN"/>
           <w14:ligatures w14:val="standardContextual"/>
         </w:rPr>
       </w:pPr>
@@ -2646,7 +2553,7 @@
         <w:rPr>
           <w:noProof/>
           <w:color w:val="000000"/>
-          <w:lang w:val="en-NL"/>
+          <w:lang/>
           <w14:scene3d>
             <w14:camera w14:prst="orthographicFront"/>
             <w14:lightRig w14:rig="threePt" w14:dir="t">
@@ -2663,7 +2570,7 @@
           <w:kern w:val="2"/>
           <w:sz w:val="24"/>
           <w:szCs w:val="24"/>
-          <w:lang w:val="en-NL" w:eastAsia="en-NL"/>
+          <w:lang w:val="en-US" w:eastAsia="zh-CN"/>
           <w14:ligatures w14:val="standardContextual"/>
         </w:rPr>
         <w:tab/>
@@ -2671,7 +2578,7 @@
       <w:r>
         <w:rPr>
           <w:noProof/>
-          <w:lang w:val="en-NL"/>
+          <w:lang/>
         </w:rPr>
         <w:t>Learning Outcomes</w:t>
       </w:r>
@@ -2691,7 +2598,7 @@
         <w:rPr>
           <w:noProof/>
         </w:rPr>
-        <w:instrText xml:space="preserve"> PAGEREF _Toc242267100 \h </w:instrText>
+        <w:instrText xml:space="preserve"> PAGEREF _Toc242238337 \h </w:instrText>
       </w:r>
       <w:r>
         <w:rPr>
@@ -2729,7 +2636,7 @@
           <w:kern w:val="2"/>
           <w:sz w:val="24"/>
           <w:szCs w:val="24"/>
-          <w:lang w:val="en-NL" w:eastAsia="en-NL"/>
+          <w:lang w:val="en-US" w:eastAsia="zh-CN"/>
           <w14:ligatures w14:val="standardContextual"/>
         </w:rPr>
       </w:pPr>
@@ -2754,7 +2661,7 @@
           <w:kern w:val="2"/>
           <w:sz w:val="24"/>
           <w:szCs w:val="24"/>
-          <w:lang w:val="en-NL" w:eastAsia="en-NL"/>
+          <w:lang w:val="en-US" w:eastAsia="zh-CN"/>
           <w14:ligatures w14:val="standardContextual"/>
         </w:rPr>
         <w:tab/>
@@ -2782,7 +2689,7 @@
         <w:rPr>
           <w:noProof/>
         </w:rPr>
-        <w:instrText xml:space="preserve"> PAGEREF _Toc242267101 \h </w:instrText>
+        <w:instrText xml:space="preserve"> PAGEREF _Toc242238338 \h </w:instrText>
       </w:r>
       <w:r>
         <w:rPr>
@@ -2820,7 +2727,7 @@
           <w:kern w:val="2"/>
           <w:sz w:val="24"/>
           <w:szCs w:val="24"/>
-          <w:lang w:val="en-NL" w:eastAsia="en-NL"/>
+          <w:lang w:val="en-US" w:eastAsia="zh-CN"/>
           <w14:ligatures w14:val="standardContextual"/>
         </w:rPr>
       </w:pPr>
@@ -2838,7 +2745,7 @@
           <w:kern w:val="2"/>
           <w:sz w:val="24"/>
           <w:szCs w:val="24"/>
-          <w:lang w:val="en-NL" w:eastAsia="en-NL"/>
+          <w:lang w:val="en-US" w:eastAsia="zh-CN"/>
           <w14:ligatures w14:val="standardContextual"/>
         </w:rPr>
         <w:tab/>
@@ -2866,7 +2773,7 @@
         <w:rPr>
           <w:noProof/>
         </w:rPr>
-        <w:instrText xml:space="preserve"> PAGEREF _Toc242267102 \h </w:instrText>
+        <w:instrText xml:space="preserve"> PAGEREF _Toc242238339 \h </w:instrText>
       </w:r>
       <w:r>
         <w:rPr>
@@ -2904,7 +2811,7 @@
           <w:kern w:val="2"/>
           <w:sz w:val="24"/>
           <w:szCs w:val="24"/>
-          <w:lang w:val="en-NL" w:eastAsia="en-NL"/>
+          <w:lang w:val="en-US" w:eastAsia="zh-CN"/>
           <w14:ligatures w14:val="standardContextual"/>
         </w:rPr>
       </w:pPr>
@@ -2929,7 +2836,7 @@
           <w:kern w:val="2"/>
           <w:sz w:val="24"/>
           <w:szCs w:val="24"/>
-          <w:lang w:val="en-NL" w:eastAsia="en-NL"/>
+          <w:lang w:val="en-US" w:eastAsia="zh-CN"/>
           <w14:ligatures w14:val="standardContextual"/>
         </w:rPr>
         <w:tab/>
@@ -2957,7 +2864,7 @@
         <w:rPr>
           <w:noProof/>
         </w:rPr>
-        <w:instrText xml:space="preserve"> PAGEREF _Toc242267103 \h </w:instrText>
+        <w:instrText xml:space="preserve"> PAGEREF _Toc242238340 \h </w:instrText>
       </w:r>
       <w:r>
         <w:rPr>
@@ -2995,7 +2902,7 @@
           <w:kern w:val="2"/>
           <w:sz w:val="24"/>
           <w:szCs w:val="24"/>
-          <w:lang w:val="en-NL" w:eastAsia="en-NL"/>
+          <w:lang w:val="en-US" w:eastAsia="zh-CN"/>
           <w14:ligatures w14:val="standardContextual"/>
         </w:rPr>
       </w:pPr>
@@ -3020,7 +2927,7 @@
           <w:kern w:val="2"/>
           <w:sz w:val="24"/>
           <w:szCs w:val="24"/>
-          <w:lang w:val="en-NL" w:eastAsia="en-NL"/>
+          <w:lang w:val="en-US" w:eastAsia="zh-CN"/>
           <w14:ligatures w14:val="standardContextual"/>
         </w:rPr>
         <w:tab/>
@@ -3048,7 +2955,7 @@
         <w:rPr>
           <w:noProof/>
         </w:rPr>
-        <w:instrText xml:space="preserve"> PAGEREF _Toc242267104 \h </w:instrText>
+        <w:instrText xml:space="preserve"> PAGEREF _Toc242238341 \h </w:instrText>
       </w:r>
       <w:r>
         <w:rPr>
@@ -3086,7 +2993,7 @@
           <w:kern w:val="2"/>
           <w:sz w:val="24"/>
           <w:szCs w:val="24"/>
-          <w:lang w:val="en-NL" w:eastAsia="en-NL"/>
+          <w:lang w:val="en-US" w:eastAsia="zh-CN"/>
           <w14:ligatures w14:val="standardContextual"/>
         </w:rPr>
       </w:pPr>
@@ -3111,7 +3018,7 @@
           <w:kern w:val="2"/>
           <w:sz w:val="24"/>
           <w:szCs w:val="24"/>
-          <w:lang w:val="en-NL" w:eastAsia="en-NL"/>
+          <w:lang w:val="en-US" w:eastAsia="zh-CN"/>
           <w14:ligatures w14:val="standardContextual"/>
         </w:rPr>
         <w:tab/>
@@ -3139,7 +3046,7 @@
         <w:rPr>
           <w:noProof/>
         </w:rPr>
-        <w:instrText xml:space="preserve"> PAGEREF _Toc242267105 \h </w:instrText>
+        <w:instrText xml:space="preserve"> PAGEREF _Toc242238342 \h </w:instrText>
       </w:r>
       <w:r>
         <w:rPr>
@@ -3177,7 +3084,7 @@
           <w:kern w:val="2"/>
           <w:sz w:val="24"/>
           <w:szCs w:val="24"/>
-          <w:lang w:val="en-NL" w:eastAsia="en-NL"/>
+          <w:lang w:val="en-US" w:eastAsia="zh-CN"/>
           <w14:ligatures w14:val="standardContextual"/>
         </w:rPr>
       </w:pPr>
@@ -3202,7 +3109,7 @@
           <w:kern w:val="2"/>
           <w:sz w:val="24"/>
           <w:szCs w:val="24"/>
-          <w:lang w:val="en-NL" w:eastAsia="en-NL"/>
+          <w:lang w:val="en-US" w:eastAsia="zh-CN"/>
           <w14:ligatures w14:val="standardContextual"/>
         </w:rPr>
         <w:tab/>
@@ -3230,7 +3137,7 @@
         <w:rPr>
           <w:noProof/>
         </w:rPr>
-        <w:instrText xml:space="preserve"> PAGEREF _Toc242267106 \h </w:instrText>
+        <w:instrText xml:space="preserve"> PAGEREF _Toc242238343 \h </w:instrText>
       </w:r>
       <w:r>
         <w:rPr>
@@ -3268,7 +3175,7 @@
           <w:kern w:val="2"/>
           <w:sz w:val="24"/>
           <w:szCs w:val="24"/>
-          <w:lang w:val="en-NL" w:eastAsia="en-NL"/>
+          <w:lang w:val="en-US" w:eastAsia="zh-CN"/>
           <w14:ligatures w14:val="standardContextual"/>
         </w:rPr>
       </w:pPr>
@@ -3286,7 +3193,7 @@
           <w:kern w:val="2"/>
           <w:sz w:val="24"/>
           <w:szCs w:val="24"/>
-          <w:lang w:val="en-NL" w:eastAsia="en-NL"/>
+          <w:lang w:val="en-US" w:eastAsia="zh-CN"/>
           <w14:ligatures w14:val="standardContextual"/>
         </w:rPr>
         <w:tab/>
@@ -3314,7 +3221,7 @@
         <w:rPr>
           <w:noProof/>
         </w:rPr>
-        <w:instrText xml:space="preserve"> PAGEREF _Toc242267107 \h </w:instrText>
+        <w:instrText xml:space="preserve"> PAGEREF _Toc242238344 \h </w:instrText>
       </w:r>
       <w:r>
         <w:rPr>
@@ -3352,7 +3259,7 @@
           <w:kern w:val="2"/>
           <w:sz w:val="24"/>
           <w:szCs w:val="24"/>
-          <w:lang w:val="en-NL" w:eastAsia="en-NL"/>
+          <w:lang w:val="en-US" w:eastAsia="zh-CN"/>
           <w14:ligatures w14:val="standardContextual"/>
         </w:rPr>
       </w:pPr>
@@ -3377,7 +3284,7 @@
           <w:kern w:val="2"/>
           <w:sz w:val="24"/>
           <w:szCs w:val="24"/>
-          <w:lang w:val="en-NL" w:eastAsia="en-NL"/>
+          <w:lang w:val="en-US" w:eastAsia="zh-CN"/>
           <w14:ligatures w14:val="standardContextual"/>
         </w:rPr>
         <w:tab/>
@@ -3405,7 +3312,7 @@
         <w:rPr>
           <w:noProof/>
         </w:rPr>
-        <w:instrText xml:space="preserve"> PAGEREF _Toc242267108 \h </w:instrText>
+        <w:instrText xml:space="preserve"> PAGEREF _Toc242238345 \h </w:instrText>
       </w:r>
       <w:r>
         <w:rPr>
@@ -3443,7 +3350,7 @@
           <w:kern w:val="2"/>
           <w:sz w:val="24"/>
           <w:szCs w:val="24"/>
-          <w:lang w:val="en-NL" w:eastAsia="en-NL"/>
+          <w:lang w:val="en-US" w:eastAsia="zh-CN"/>
           <w14:ligatures w14:val="standardContextual"/>
         </w:rPr>
       </w:pPr>
@@ -3468,7 +3375,7 @@
           <w:kern w:val="2"/>
           <w:sz w:val="24"/>
           <w:szCs w:val="24"/>
-          <w:lang w:val="en-NL" w:eastAsia="en-NL"/>
+          <w:lang w:val="en-US" w:eastAsia="zh-CN"/>
           <w14:ligatures w14:val="standardContextual"/>
         </w:rPr>
         <w:tab/>
@@ -3483,6 +3390,7 @@
       <w:r>
         <w:rPr>
           <w:noProof/>
+          <w:lang w:val="en-US"/>
         </w:rPr>
         <w:tab/>
       </w:r>
@@ -3495,8 +3403,9 @@
       <w:r>
         <w:rPr>
           <w:noProof/>
-        </w:rPr>
-        <w:instrText xml:space="preserve"> PAGEREF _Toc242267109 \h </w:instrText>
+          <w:lang w:val="en-US"/>
+        </w:rPr>
+        <w:instrText xml:space="preserve"> PAGEREF _Toc242238346 \h </w:instrText>
       </w:r>
       <w:r>
         <w:rPr>
@@ -3512,6 +3421,7 @@
       <w:r>
         <w:rPr>
           <w:noProof/>
+          <w:lang w:val="en-US"/>
         </w:rPr>
         <w:t>15</w:t>
       </w:r>
@@ -3534,7 +3444,7 @@
           <w:kern w:val="2"/>
           <w:sz w:val="24"/>
           <w:szCs w:val="24"/>
-          <w:lang w:val="en-NL" w:eastAsia="en-NL"/>
+          <w:lang w:val="en-US" w:eastAsia="zh-CN"/>
           <w14:ligatures w14:val="standardContextual"/>
         </w:rPr>
       </w:pPr>
@@ -3552,7 +3462,7 @@
           <w:kern w:val="2"/>
           <w:sz w:val="24"/>
           <w:szCs w:val="24"/>
-          <w:lang w:val="en-NL" w:eastAsia="en-NL"/>
+          <w:lang w:val="en-US" w:eastAsia="zh-CN"/>
           <w14:ligatures w14:val="standardContextual"/>
         </w:rPr>
         <w:tab/>
@@ -3580,7 +3490,7 @@
         <w:rPr>
           <w:noProof/>
         </w:rPr>
-        <w:instrText xml:space="preserve"> PAGEREF _Toc242267110 \h </w:instrText>
+        <w:instrText xml:space="preserve"> PAGEREF _Toc242238347 \h </w:instrText>
       </w:r>
       <w:r>
         <w:rPr>
@@ -3618,7 +3528,7 @@
           <w:kern w:val="2"/>
           <w:sz w:val="24"/>
           <w:szCs w:val="24"/>
-          <w:lang w:val="en-NL" w:eastAsia="en-NL"/>
+          <w:lang w:val="en-US" w:eastAsia="zh-CN"/>
           <w14:ligatures w14:val="standardContextual"/>
         </w:rPr>
       </w:pPr>
@@ -3642,7 +3552,7 @@
           <w:kern w:val="2"/>
           <w:sz w:val="24"/>
           <w:szCs w:val="24"/>
-          <w:lang w:val="en-NL" w:eastAsia="en-NL"/>
+          <w:lang w:val="en-US" w:eastAsia="zh-CN"/>
           <w14:ligatures w14:val="standardContextual"/>
         </w:rPr>
         <w:tab/>
@@ -3669,7 +3579,7 @@
         <w:rPr>
           <w:noProof/>
         </w:rPr>
-        <w:instrText xml:space="preserve"> PAGEREF _Toc242267111 \h </w:instrText>
+        <w:instrText xml:space="preserve"> PAGEREF _Toc242238348 \h </w:instrText>
       </w:r>
       <w:r>
         <w:rPr>
@@ -3719,7 +3629,7 @@
       <w:bookmarkStart w:id="5" w:name="_Toc327581593"/>
       <w:bookmarkStart w:id="6" w:name="_Toc327583373"/>
       <w:bookmarkStart w:id="7" w:name="_Toc339966112"/>
-      <w:bookmarkStart w:id="8" w:name="_Toc242267089"/>
+      <w:bookmarkStart w:id="8" w:name="_Toc242238326"/>
       <w:r>
         <w:rPr>
           <w:lang w:val="en-GB"/>
@@ -3750,7 +3660,7 @@
           <w:lang w:val="en-GB"/>
         </w:rPr>
       </w:pPr>
-      <w:bookmarkStart w:id="9" w:name="_Toc242267090"/>
+      <w:bookmarkStart w:id="9" w:name="_Toc242238327"/>
       <w:r>
         <w:rPr>
           <w:lang w:val="en-GB"/>
@@ -3866,7 +3776,7 @@
           <w:rFonts w:cs="Arial"/>
           <w:sz w:val="24"/>
           <w:szCs w:val="24"/>
-          <w:lang w:val="en-NL" w:eastAsia="en-NL"/>
+          <w:lang/>
         </w:rPr>
       </w:pPr>
       <w:r>
@@ -3874,7 +3784,7 @@
           <w:rFonts w:cs="Arial"/>
           <w:sz w:val="24"/>
           <w:szCs w:val="24"/>
-          <w:lang w:val="en-NL" w:eastAsia="en-NL"/>
+          <w:lang/>
         </w:rPr>
         <w:t>The company has developed and self-hosts its own AI orchestration layer, including agents, MCP servers and workflows. However, the Large Language Models (LLMs) used by these systems are primarily accessed through external cloud APIs, such as Azure OpenAI and AWS Bedrock/Anthropic. Although agreements and data-retention policies are in place to allow these services to be used safely, the company sees an opportunity to gain more control over its AI infrastructure by introducing self-hosted LLM inference.</w:t>
       </w:r>
@@ -3915,7 +3825,7 @@
       <w:bookmarkStart w:id="10" w:name="_Toc327581046"/>
       <w:bookmarkStart w:id="11" w:name="_Toc327581596"/>
       <w:bookmarkStart w:id="12" w:name="_Toc327583376"/>
-      <w:bookmarkStart w:id="13" w:name="_Toc242267091"/>
+      <w:bookmarkStart w:id="13" w:name="_Toc242238328"/>
       <w:r>
         <w:rPr>
           <w:lang w:val="en-GB"/>
@@ -3948,7 +3858,7 @@
           <w:rFonts w:cs="Arial"/>
           <w:sz w:val="24"/>
           <w:szCs w:val="24"/>
-          <w:lang w:val="en-NL" w:eastAsia="en-NL"/>
+          <w:lang/>
         </w:rPr>
       </w:pPr>
       <w:r>
@@ -3956,56 +3866,36 @@
           <w:rFonts w:cs="Arial"/>
           <w:sz w:val="24"/>
           <w:szCs w:val="24"/>
-          <w:lang w:val="en-NL" w:eastAsia="en-NL"/>
-        </w:rPr>
-        <w:t xml:space="preserve">The goal of this project is to investigate to what extent cloud-based LLM APIs can be replaced or complemented by self-hosted LLMs within </w:t>
-      </w:r>
-      <w:proofErr w:type="spellStart"/>
-      <w:r>
+          <w:lang/>
+        </w:rPr>
+        <w:t>The goal of this project is to investigate to what extent cloud-based LLM APIs can be replaced or complemented by self-hosted LLMs within Nahayat's existing AI ecosystem. The investigation will initially cover all four use-case categories identified as relevant by the company:</w:t>
+      </w:r>
+    </w:p>
+    <w:p>
+      <w:pPr>
         <w:rPr>
           <w:rFonts w:cs="Arial"/>
           <w:sz w:val="24"/>
           <w:szCs w:val="24"/>
-          <w:lang w:val="en-NL" w:eastAsia="en-NL"/>
-        </w:rPr>
-        <w:t>Nahayat's</w:t>
-      </w:r>
-      <w:proofErr w:type="spellEnd"/>
-      <w:r>
+          <w:lang/>
+        </w:rPr>
+      </w:pPr>
+    </w:p>
+    <w:p>
+      <w:pPr>
         <w:rPr>
           <w:rFonts w:cs="Arial"/>
           <w:sz w:val="24"/>
           <w:szCs w:val="24"/>
-          <w:lang w:val="en-NL" w:eastAsia="en-NL"/>
-        </w:rPr>
-        <w:t xml:space="preserve"> existing AI ecosystem. The investigation will initially cover all four use-case categories identified as relevant by the company:</w:t>
-      </w:r>
-    </w:p>
-    <w:p>
-      <w:pPr>
+          <w:lang/>
+        </w:rPr>
+      </w:pPr>
+      <w:r>
         <w:rPr>
           <w:rFonts w:cs="Arial"/>
           <w:sz w:val="24"/>
           <w:szCs w:val="24"/>
-          <w:lang w:val="en-NL" w:eastAsia="en-NL"/>
-        </w:rPr>
-      </w:pPr>
-    </w:p>
-    <w:p>
-      <w:pPr>
-        <w:rPr>
-          <w:rFonts w:cs="Arial"/>
-          <w:sz w:val="24"/>
-          <w:szCs w:val="24"/>
-          <w:lang w:val="en-NL" w:eastAsia="en-NL"/>
-        </w:rPr>
-      </w:pPr>
-      <w:r>
-        <w:rPr>
-          <w:rFonts w:cs="Arial"/>
-          <w:sz w:val="24"/>
-          <w:szCs w:val="24"/>
-          <w:lang w:val="en-NL" w:eastAsia="en-NL"/>
+          <w:lang/>
         </w:rPr>
         <w:t xml:space="preserve">- </w:t>
       </w:r>
@@ -4016,7 +3906,7 @@
           <w:bCs/>
           <w:sz w:val="24"/>
           <w:szCs w:val="24"/>
-          <w:lang w:val="en-NL" w:eastAsia="en-NL"/>
+          <w:lang/>
         </w:rPr>
         <w:t>Conversational/chat</w:t>
       </w:r>
@@ -4025,7 +3915,7 @@
           <w:rFonts w:cs="Arial"/>
           <w:sz w:val="24"/>
           <w:szCs w:val="24"/>
-          <w:lang w:val="en-NL" w:eastAsia="en-NL"/>
+          <w:lang/>
         </w:rPr>
         <w:t>: evaluating the ability of local LLMs to provide useful and coherent conversational responses.</w:t>
       </w:r>
@@ -4036,7 +3926,7 @@
           <w:rFonts w:cs="Arial"/>
           <w:sz w:val="24"/>
           <w:szCs w:val="24"/>
-          <w:lang w:val="en-NL" w:eastAsia="en-NL"/>
+          <w:lang/>
         </w:rPr>
       </w:pPr>
       <w:r>
@@ -4044,7 +3934,7 @@
           <w:rFonts w:cs="Arial"/>
           <w:sz w:val="24"/>
           <w:szCs w:val="24"/>
-          <w:lang w:val="en-NL" w:eastAsia="en-NL"/>
+          <w:lang/>
         </w:rPr>
         <w:t xml:space="preserve">- </w:t>
       </w:r>
@@ -4055,7 +3945,7 @@
           <w:bCs/>
           <w:sz w:val="24"/>
           <w:szCs w:val="24"/>
-          <w:lang w:val="en-NL" w:eastAsia="en-NL"/>
+          <w:lang/>
         </w:rPr>
         <w:t>Retrieval-Augmented Generation (RAG):</w:t>
       </w:r>
@@ -4064,7 +3954,7 @@
           <w:rFonts w:cs="Arial"/>
           <w:sz w:val="24"/>
           <w:szCs w:val="24"/>
-          <w:lang w:val="en-NL" w:eastAsia="en-NL"/>
+          <w:lang/>
         </w:rPr>
         <w:t xml:space="preserve"> evaluating the ability of local LLMs to answer questions using retrieved information from an external knowledge source.</w:t>
       </w:r>
@@ -4075,7 +3965,7 @@
           <w:rFonts w:cs="Arial"/>
           <w:sz w:val="24"/>
           <w:szCs w:val="24"/>
-          <w:lang w:val="en-NL" w:eastAsia="en-NL"/>
+          <w:lang/>
         </w:rPr>
       </w:pPr>
       <w:r>
@@ -4085,7 +3975,7 @@
           <w:bCs/>
           <w:sz w:val="24"/>
           <w:szCs w:val="24"/>
-          <w:lang w:val="en-NL" w:eastAsia="en-NL"/>
+          <w:lang/>
         </w:rPr>
         <w:t>- Classification and smaller LLM tasks:</w:t>
       </w:r>
@@ -4094,7 +3984,7 @@
           <w:rFonts w:cs="Arial"/>
           <w:sz w:val="24"/>
           <w:szCs w:val="24"/>
-          <w:lang w:val="en-NL" w:eastAsia="en-NL"/>
+          <w:lang/>
         </w:rPr>
         <w:t xml:space="preserve"> evaluating local models on structured tasks where smaller and less resource-intensive models may be sufficient.</w:t>
       </w:r>
@@ -4105,7 +3995,7 @@
           <w:rFonts w:cs="Arial"/>
           <w:sz w:val="24"/>
           <w:szCs w:val="24"/>
-          <w:lang w:val="en-NL" w:eastAsia="en-NL"/>
+          <w:lang/>
         </w:rPr>
       </w:pPr>
       <w:r>
@@ -4113,7 +4003,7 @@
           <w:rFonts w:cs="Arial"/>
           <w:sz w:val="24"/>
           <w:szCs w:val="24"/>
-          <w:lang w:val="en-NL" w:eastAsia="en-NL"/>
+          <w:lang/>
         </w:rPr>
         <w:t xml:space="preserve">- </w:t>
       </w:r>
@@ -4124,7 +4014,7 @@
           <w:bCs/>
           <w:sz w:val="24"/>
           <w:szCs w:val="24"/>
-          <w:lang w:val="en-NL" w:eastAsia="en-NL"/>
+          <w:lang/>
         </w:rPr>
         <w:t>Agentic tool use / MCP</w:t>
       </w:r>
@@ -4133,7 +4023,7 @@
           <w:rFonts w:cs="Arial"/>
           <w:sz w:val="24"/>
           <w:szCs w:val="24"/>
-          <w:lang w:val="en-NL" w:eastAsia="en-NL"/>
+          <w:lang/>
         </w:rPr>
         <w:t>: evaluating whether local LLMs can reliably select and use external tools or functions within agentic workflows.</w:t>
       </w:r>
@@ -4144,7 +4034,7 @@
           <w:rFonts w:cs="Arial"/>
           <w:sz w:val="24"/>
           <w:szCs w:val="24"/>
-          <w:lang w:val="en-NL" w:eastAsia="en-NL"/>
+          <w:lang/>
         </w:rPr>
       </w:pPr>
     </w:p>
@@ -4154,7 +4044,7 @@
           <w:rFonts w:cs="Arial"/>
           <w:sz w:val="24"/>
           <w:szCs w:val="24"/>
-          <w:lang w:val="en-NL" w:eastAsia="en-NL"/>
+          <w:lang/>
         </w:rPr>
       </w:pPr>
       <w:r>
@@ -4162,40 +4052,39 @@
           <w:rFonts w:cs="Arial"/>
           <w:sz w:val="24"/>
           <w:szCs w:val="24"/>
-          <w:lang w:val="en-NL" w:eastAsia="en-NL"/>
-        </w:rPr>
-        <w:t xml:space="preserve">Selected self-hosted models will be tested across these use cases and compared, where applicable, with the cloud-based models currently used by </w:t>
-      </w:r>
-      <w:proofErr w:type="spellStart"/>
-      <w:r>
+          <w:lang/>
+        </w:rPr>
+        <w:t>Selected self-hosted models will be tested across these use cases and compared, where applicable, with the cloud-based models currently used by Nahayat. The evaluation will consider response quality, performance, resource usage, reliability, integration feasibility and hardware requirements.</w:t>
+      </w:r>
+    </w:p>
+    <w:p>
+      <w:pPr>
         <w:rPr>
           <w:rFonts w:cs="Arial"/>
           <w:sz w:val="24"/>
           <w:szCs w:val="24"/>
-          <w:lang w:val="en-NL" w:eastAsia="en-NL"/>
-        </w:rPr>
-        <w:t>Nahayat</w:t>
-      </w:r>
-      <w:proofErr w:type="spellEnd"/>
-      <w:r>
+          <w:lang/>
+        </w:rPr>
+      </w:pPr>
+    </w:p>
+    <w:p>
+      <w:pPr>
         <w:rPr>
           <w:rFonts w:cs="Arial"/>
           <w:sz w:val="24"/>
           <w:szCs w:val="24"/>
-          <w:lang w:val="en-NL" w:eastAsia="en-NL"/>
-        </w:rPr>
-        <w:t>. The evaluation will consider response quality, performance, resource usage, reliability, integration feasibility and hardware requirements.</w:t>
-      </w:r>
-    </w:p>
-    <w:p>
-      <w:pPr>
+          <w:lang/>
+        </w:rPr>
+      </w:pPr>
+      <w:r>
         <w:rPr>
           <w:rFonts w:cs="Arial"/>
           <w:sz w:val="24"/>
           <w:szCs w:val="24"/>
-          <w:lang w:val="en-NL" w:eastAsia="en-NL"/>
-        </w:rPr>
-      </w:pPr>
+          <w:lang/>
+        </w:rPr>
+        <w:t>All four use cases are initially included in the investigation. If testing demonstrates that particular use cases or model sizes are not realistically feasible on the available hardware, the scope may be refined in consultation with the company supervisor. Such a decision will be supported by the obtained technical results and documented as a finding of the project.</w:t>
+      </w:r>
     </w:p>
     <w:p>
       <w:pPr>
@@ -4203,44 +4092,25 @@
           <w:rFonts w:cs="Arial"/>
           <w:sz w:val="24"/>
           <w:szCs w:val="24"/>
-          <w:lang w:val="en-NL" w:eastAsia="en-NL"/>
-        </w:rPr>
-      </w:pPr>
-      <w:r>
+          <w:lang/>
+        </w:rPr>
+      </w:pPr>
+    </w:p>
+    <w:p>
+      <w:pPr>
         <w:rPr>
           <w:rFonts w:cs="Arial"/>
           <w:sz w:val="24"/>
           <w:szCs w:val="24"/>
-          <w:lang w:val="en-NL" w:eastAsia="en-NL"/>
-        </w:rPr>
-        <w:t>All four use cases are initially included in the investigation. If testing demonstrates that particular use cases or model sizes are not realistically feasible on the available hardware, the scope may be refined in consultation with the company supervisor. Such a decision will be supported by the obtained technical results and documented as a finding of the project.</w:t>
-      </w:r>
-    </w:p>
-    <w:p>
-      <w:pPr>
+          <w:lang/>
+        </w:rPr>
+      </w:pPr>
+      <w:r>
         <w:rPr>
           <w:rFonts w:cs="Arial"/>
           <w:sz w:val="24"/>
           <w:szCs w:val="24"/>
-          <w:lang w:val="en-NL" w:eastAsia="en-NL"/>
-        </w:rPr>
-      </w:pPr>
-    </w:p>
-    <w:p>
-      <w:pPr>
-        <w:rPr>
-          <w:rFonts w:cs="Arial"/>
-          <w:sz w:val="24"/>
-          <w:szCs w:val="24"/>
-          <w:lang w:val="en-NL" w:eastAsia="en-NL"/>
-        </w:rPr>
-      </w:pPr>
-      <w:r>
-        <w:rPr>
-          <w:rFonts w:cs="Arial"/>
-          <w:sz w:val="24"/>
-          <w:szCs w:val="24"/>
-          <w:lang w:val="en-NL" w:eastAsia="en-NL"/>
+          <w:lang/>
         </w:rPr>
         <w:t>The desired outcome is a technically validated understanding of which workloads can be handled effectively by self-hosted LLMs, which are better suited to cloud-based models, and where a hybrid approach may be appropriate.</w:t>
       </w:r>
@@ -4263,7 +4133,7 @@
           <w:lang w:val="en-GB"/>
         </w:rPr>
       </w:pPr>
-      <w:bookmarkStart w:id="14" w:name="_Toc242267092"/>
+      <w:bookmarkStart w:id="14" w:name="_Toc242238329"/>
       <w:r>
         <w:rPr>
           <w:lang w:val="en-GB"/>
@@ -4352,7 +4222,7 @@
           <w:lang w:val="en-GB"/>
         </w:rPr>
       </w:pPr>
-      <w:bookmarkStart w:id="15" w:name="_Toc242267093"/>
+      <w:bookmarkStart w:id="15" w:name="_Toc242238330"/>
       <w:bookmarkEnd w:id="10"/>
       <w:bookmarkEnd w:id="11"/>
       <w:bookmarkEnd w:id="12"/>
@@ -4369,81 +4239,146 @@
         <w:rPr>
           <w:sz w:val="24"/>
           <w:szCs w:val="24"/>
-        </w:rPr>
-      </w:pPr>
-      <w:r>
-        <w:rPr>
-          <w:sz w:val="24"/>
-          <w:szCs w:val="24"/>
-        </w:rPr>
-        <w:t>The scope of this project is to investigate the technical viability of running Large Language Models (LLMs) locally on hardware provided by Nahayat. The investigation will initially cover four use-case categories: conversational/chat, RAG, classification and smaller LLM tasks, and agentic tool use through MCP or similar tool-calling mechanisms.</w:t>
-      </w:r>
-    </w:p>
-    <w:p>
-      <w:pPr>
-        <w:rPr>
-          <w:sz w:val="24"/>
-          <w:szCs w:val="24"/>
-        </w:rPr>
-      </w:pPr>
-    </w:p>
-    <w:p>
-      <w:pPr>
-        <w:rPr>
-          <w:sz w:val="24"/>
-          <w:szCs w:val="24"/>
-        </w:rPr>
-      </w:pPr>
-      <w:r>
-        <w:rPr>
-          <w:sz w:val="24"/>
-          <w:szCs w:val="24"/>
-        </w:rPr>
-        <w:t>The project includes researching and selecting suitable open-source/local LLMs, deploying them on the available hardware, developing the required benchmark or proof-of-concept implementations, and evaluating their performance across the four use cases. Where applicable, results will be compared with relevant cloud-based models currently used by Nahayat.</w:t>
-      </w:r>
-    </w:p>
-    <w:p>
-      <w:pPr>
-        <w:rPr>
-          <w:sz w:val="24"/>
-          <w:szCs w:val="24"/>
-        </w:rPr>
-      </w:pPr>
-    </w:p>
-    <w:p>
-      <w:pPr>
-        <w:rPr>
-          <w:sz w:val="24"/>
-          <w:szCs w:val="24"/>
-        </w:rPr>
-      </w:pPr>
-      <w:r>
-        <w:rPr>
-          <w:sz w:val="24"/>
-          <w:szCs w:val="24"/>
-        </w:rPr>
-        <w:t>The project does not aim to develop complete production-ready applications or replace Nahayat's existing AI infrastructure. Implementations will primarily serve research, benchmarking and proof-of-concept purposes.</w:t>
-      </w:r>
-    </w:p>
-    <w:p>
-      <w:pPr>
-        <w:rPr>
-          <w:sz w:val="24"/>
-          <w:szCs w:val="24"/>
-        </w:rPr>
-      </w:pPr>
-    </w:p>
-    <w:p>
-      <w:pPr>
-        <w:rPr>
-          <w:sz w:val="24"/>
-          <w:szCs w:val="24"/>
-        </w:rPr>
-      </w:pPr>
-      <w:r>
-        <w:rPr>
-          <w:sz w:val="24"/>
-          <w:szCs w:val="24"/>
+          <w:lang w:val="en-US"/>
+        </w:rPr>
+      </w:pPr>
+      <w:r>
+        <w:rPr>
+          <w:sz w:val="24"/>
+          <w:szCs w:val="24"/>
+          <w:lang w:val="en-US"/>
+        </w:rPr>
+        <w:t xml:space="preserve">The scope of this project is to investigate the technical viability of running Large Language Models (LLMs) locally on hardware provided by </w:t>
+      </w:r>
+      <w:proofErr w:type="spellStart"/>
+      <w:r>
+        <w:rPr>
+          <w:sz w:val="24"/>
+          <w:szCs w:val="24"/>
+          <w:lang w:val="en-US"/>
+        </w:rPr>
+        <w:t>Nahayat</w:t>
+      </w:r>
+      <w:proofErr w:type="spellEnd"/>
+      <w:r>
+        <w:rPr>
+          <w:sz w:val="24"/>
+          <w:szCs w:val="24"/>
+          <w:lang w:val="en-US"/>
+        </w:rPr>
+        <w:t>. The investigation will initially cover four use-case categories: conversational/chat, RAG, classification and smaller LLM tasks, and agentic tool use through MCP or similar tool-calling mechanisms.</w:t>
+      </w:r>
+    </w:p>
+    <w:p>
+      <w:pPr>
+        <w:rPr>
+          <w:sz w:val="24"/>
+          <w:szCs w:val="24"/>
+          <w:lang w:val="en-US"/>
+        </w:rPr>
+      </w:pPr>
+    </w:p>
+    <w:p>
+      <w:pPr>
+        <w:rPr>
+          <w:sz w:val="24"/>
+          <w:szCs w:val="24"/>
+          <w:lang w:val="en-US"/>
+        </w:rPr>
+      </w:pPr>
+      <w:r>
+        <w:rPr>
+          <w:sz w:val="24"/>
+          <w:szCs w:val="24"/>
+          <w:lang w:val="en-US"/>
+        </w:rPr>
+        <w:t xml:space="preserve">The project includes researching and selecting suitable open-source/local LLMs, deploying them on the available hardware, developing the required benchmark or proof-of-concept implementations, and evaluating their performance across the four use cases. Where applicable, results will be compared with relevant cloud-based models currently used by </w:t>
+      </w:r>
+      <w:proofErr w:type="spellStart"/>
+      <w:r>
+        <w:rPr>
+          <w:sz w:val="24"/>
+          <w:szCs w:val="24"/>
+          <w:lang w:val="en-US"/>
+        </w:rPr>
+        <w:t>Nahayat</w:t>
+      </w:r>
+      <w:proofErr w:type="spellEnd"/>
+      <w:r>
+        <w:rPr>
+          <w:sz w:val="24"/>
+          <w:szCs w:val="24"/>
+          <w:lang w:val="en-US"/>
+        </w:rPr>
+        <w:t>.</w:t>
+      </w:r>
+    </w:p>
+    <w:p>
+      <w:pPr>
+        <w:rPr>
+          <w:sz w:val="24"/>
+          <w:szCs w:val="24"/>
+          <w:lang w:val="en-US"/>
+        </w:rPr>
+      </w:pPr>
+    </w:p>
+    <w:p>
+      <w:pPr>
+        <w:rPr>
+          <w:sz w:val="24"/>
+          <w:szCs w:val="24"/>
+          <w:lang w:val="en-US"/>
+        </w:rPr>
+      </w:pPr>
+      <w:r>
+        <w:rPr>
+          <w:sz w:val="24"/>
+          <w:szCs w:val="24"/>
+          <w:lang w:val="en-US"/>
+        </w:rPr>
+        <w:t xml:space="preserve">The project does not aim to develop complete production-ready applications or replace </w:t>
+      </w:r>
+      <w:proofErr w:type="spellStart"/>
+      <w:r>
+        <w:rPr>
+          <w:sz w:val="24"/>
+          <w:szCs w:val="24"/>
+          <w:lang w:val="en-US"/>
+        </w:rPr>
+        <w:t>Nahayat's</w:t>
+      </w:r>
+      <w:proofErr w:type="spellEnd"/>
+      <w:r>
+        <w:rPr>
+          <w:sz w:val="24"/>
+          <w:szCs w:val="24"/>
+          <w:lang w:val="en-US"/>
+        </w:rPr>
+        <w:t xml:space="preserve"> existing AI infrastructure. Implementations will primarily serve research, benchmarking and proof-of-concept purposes.</w:t>
+      </w:r>
+    </w:p>
+    <w:p>
+      <w:pPr>
+        <w:rPr>
+          <w:sz w:val="24"/>
+          <w:szCs w:val="24"/>
+          <w:lang w:val="en-US"/>
+        </w:rPr>
+      </w:pPr>
+    </w:p>
+    <w:p>
+      <w:pPr>
+        <w:rPr>
+          <w:sz w:val="24"/>
+          <w:szCs w:val="24"/>
+          <w:lang w:val="en-US"/>
+        </w:rPr>
+      </w:pPr>
+      <w:r>
+        <w:rPr>
+          <w:sz w:val="24"/>
+          <w:szCs w:val="24"/>
+          <w:lang w:val="en-US"/>
         </w:rPr>
         <w:t>The four use cases remain in scope unless technical evidence, such as hardware limitations or insufficient model capability, demonstrates that further investigation of a particular case is not feasible. Any reduction in scope will be discussed and agreed with the company supervisor and documented together with the technical justification.</w:t>
       </w:r>
@@ -4453,22 +4388,25 @@
         <w:rPr>
           <w:sz w:val="24"/>
           <w:szCs w:val="24"/>
-        </w:rPr>
-      </w:pPr>
-    </w:p>
-    <w:p>
-      <w:pPr>
-        <w:rPr>
-          <w:sz w:val="24"/>
-          <w:szCs w:val="24"/>
-        </w:rPr>
-      </w:pPr>
-    </w:p>
-    <w:p>
-      <w:pPr>
-        <w:rPr>
-          <w:sz w:val="24"/>
-          <w:szCs w:val="24"/>
+          <w:lang w:val="en-US"/>
+        </w:rPr>
+      </w:pPr>
+    </w:p>
+    <w:p>
+      <w:pPr>
+        <w:rPr>
+          <w:sz w:val="24"/>
+          <w:szCs w:val="24"/>
+          <w:lang w:val="en-US"/>
+        </w:rPr>
+      </w:pPr>
+    </w:p>
+    <w:p>
+      <w:pPr>
+        <w:rPr>
+          <w:sz w:val="24"/>
+          <w:szCs w:val="24"/>
+          <w:lang w:val="en-US"/>
         </w:rPr>
       </w:pPr>
     </w:p>
@@ -4641,8 +4579,25 @@
             <w:r>
               <w:rPr>
                 <w:sz w:val="20"/>
-              </w:rPr>
-              <w:t>Developing a complete production-ready AI platform or replacing Nahayat's existing AI infrastructure.</w:t>
+                <w:lang w:val="en-US"/>
+              </w:rPr>
+              <w:t xml:space="preserve">Developing a complete production-ready AI platform or replacing </w:t>
+            </w:r>
+            <w:proofErr w:type="spellStart"/>
+            <w:r>
+              <w:rPr>
+                <w:sz w:val="20"/>
+                <w:lang w:val="en-US"/>
+              </w:rPr>
+              <w:t>Nahayat's</w:t>
+            </w:r>
+            <w:proofErr w:type="spellEnd"/>
+            <w:r>
+              <w:rPr>
+                <w:sz w:val="20"/>
+                <w:lang w:val="en-US"/>
+              </w:rPr>
+              <w:t xml:space="preserve"> existing AI infrastructure.</w:t>
             </w:r>
           </w:p>
         </w:tc>
@@ -4672,8 +4627,25 @@
             <w:r>
               <w:rPr>
                 <w:sz w:val="20"/>
-              </w:rPr>
-              <w:t>Setting up and configuring selected LLMs on the hardware provided by Nahayat.</w:t>
+                <w:lang w:val="en-US"/>
+              </w:rPr>
+              <w:t xml:space="preserve">Setting up and configuring selected LLMs on the hardware provided by </w:t>
+            </w:r>
+            <w:proofErr w:type="spellStart"/>
+            <w:r>
+              <w:rPr>
+                <w:sz w:val="20"/>
+                <w:lang w:val="en-US"/>
+              </w:rPr>
+              <w:t>Nahayat</w:t>
+            </w:r>
+            <w:proofErr w:type="spellEnd"/>
+            <w:r>
+              <w:rPr>
+                <w:sz w:val="20"/>
+                <w:lang w:val="en-US"/>
+              </w:rPr>
+              <w:t>.</w:t>
             </w:r>
           </w:p>
         </w:tc>
@@ -4697,6 +4669,7 @@
             <w:r>
               <w:rPr>
                 <w:sz w:val="20"/>
+                <w:lang w:val="en-US"/>
               </w:rPr>
               <w:t>Developing complete production applications for every tested use case. Implementations created during the project will primarily serve benchmarking and proof-of-concept purposes.</w:t>
             </w:r>
@@ -4722,7 +4695,7 @@
           <w:lang w:val="en-GB"/>
         </w:rPr>
       </w:pPr>
-      <w:bookmarkStart w:id="16" w:name="_Toc242267094"/>
+      <w:bookmarkStart w:id="16" w:name="_Toc242238331"/>
       <w:r>
         <w:rPr>
           <w:lang w:val="en-GB"/>
@@ -4885,7 +4858,7 @@
           <w:lang w:val="en-GB"/>
         </w:rPr>
       </w:pPr>
-      <w:bookmarkStart w:id="17" w:name="_Toc242267095"/>
+      <w:bookmarkStart w:id="17" w:name="_Toc242238332"/>
       <w:r>
         <w:rPr>
           <w:lang w:val="en-GB"/>
@@ -5537,7 +5510,7 @@
           <w:lang w:val="en-GB"/>
         </w:rPr>
       </w:pPr>
-      <w:bookmarkStart w:id="21" w:name="_Toc242267096"/>
+      <w:bookmarkStart w:id="21" w:name="_Toc242238333"/>
       <w:r>
         <w:rPr>
           <w:lang w:val="en-GB"/>
@@ -5649,12 +5622,24 @@
           <w:ilvl w:val="0"/>
           <w:numId w:val="36"/>
         </w:numPr>
-      </w:pPr>
-      <w:r>
+        <w:rPr>
+          <w:lang w:val="en-US"/>
+        </w:rPr>
+      </w:pPr>
+      <w:r>
+        <w:rPr>
+          <w:lang w:val="en-US"/>
+        </w:rPr>
         <w:t>Which locally hosted LLMs can run acceptably on the available hardware, and what are their hardware requirements?</w:t>
       </w:r>
     </w:p>
-    <w:p/>
+    <w:p>
+      <w:pPr>
+        <w:rPr>
+          <w:lang w:val="en-US"/>
+        </w:rPr>
+      </w:pPr>
+    </w:p>
     <w:p>
       <w:pPr>
         <w:pStyle w:val="ListParagraph"/>
@@ -5662,20 +5647,38 @@
           <w:ilvl w:val="0"/>
           <w:numId w:val="36"/>
         </w:numPr>
-      </w:pPr>
-      <w:r>
+        <w:rPr>
+          <w:lang w:val="en-US"/>
+        </w:rPr>
+      </w:pPr>
+      <w:r>
+        <w:rPr>
+          <w:lang w:val="en-US"/>
+        </w:rPr>
         <w:t xml:space="preserve">How does the output quality of locally hosted LLMs compare with the commercial cloud-based models currently used by </w:t>
       </w:r>
       <w:proofErr w:type="spellStart"/>
       <w:r>
+        <w:rPr>
+          <w:lang w:val="en-US"/>
+        </w:rPr>
         <w:t>Nahayat</w:t>
       </w:r>
       <w:proofErr w:type="spellEnd"/>
       <w:r>
+        <w:rPr>
+          <w:lang w:val="en-US"/>
+        </w:rPr>
         <w:t xml:space="preserve"> across the investigated use cases?</w:t>
       </w:r>
     </w:p>
-    <w:p/>
+    <w:p>
+      <w:pPr>
+        <w:rPr>
+          <w:lang w:val="en-US"/>
+        </w:rPr>
+      </w:pPr>
+    </w:p>
     <w:p>
       <w:pPr>
         <w:pStyle w:val="ListParagraph"/>
@@ -5683,12 +5686,24 @@
           <w:ilvl w:val="0"/>
           <w:numId w:val="36"/>
         </w:numPr>
-      </w:pPr>
-      <w:r>
+        <w:rPr>
+          <w:lang w:val="en-US"/>
+        </w:rPr>
+      </w:pPr>
+      <w:r>
+        <w:rPr>
+          <w:lang w:val="en-US"/>
+        </w:rPr>
         <w:t>What technical limitations do locally hosted LLMs have regarding factors such as inference speed, context length, resource usage and tool-calling reliability?</w:t>
       </w:r>
     </w:p>
-    <w:p/>
+    <w:p>
+      <w:pPr>
+        <w:rPr>
+          <w:lang w:val="en-US"/>
+        </w:rPr>
+      </w:pPr>
+    </w:p>
     <w:p>
       <w:pPr>
         <w:pStyle w:val="ListParagraph"/>
@@ -5696,12 +5711,38 @@
           <w:ilvl w:val="0"/>
           <w:numId w:val="36"/>
         </w:numPr>
-      </w:pPr>
-      <w:r>
-        <w:t>To what extent are conversational/chat tasks, RAG, classification and smaller LLM tasks, and agentic tool use technically viable with locally hosted LLMs?</w:t>
-      </w:r>
-    </w:p>
-    <w:p/>
+        <w:rPr>
+          <w:lang w:val="en-US"/>
+        </w:rPr>
+      </w:pPr>
+      <w:r>
+        <w:rPr>
+          <w:lang w:val="en-US"/>
+        </w:rPr>
+        <w:t xml:space="preserve">To what extent are conversational/chat tasks, RAG, classification and smaller LLM tasks, and agentic </w:t>
+      </w:r>
+      <w:proofErr w:type="gramStart"/>
+      <w:r>
+        <w:rPr>
+          <w:lang w:val="en-US"/>
+        </w:rPr>
+        <w:t>tool use</w:t>
+      </w:r>
+      <w:proofErr w:type="gramEnd"/>
+      <w:r>
+        <w:rPr>
+          <w:lang w:val="en-US"/>
+        </w:rPr>
+        <w:t xml:space="preserve"> technically viable with locally hosted LLMs?</w:t>
+      </w:r>
+    </w:p>
+    <w:p>
+      <w:pPr>
+        <w:rPr>
+          <w:lang w:val="en-US"/>
+        </w:rPr>
+      </w:pPr>
+    </w:p>
     <w:p>
       <w:pPr>
         <w:pStyle w:val="ListParagraph"/>
@@ -5709,8 +5750,14 @@
           <w:ilvl w:val="0"/>
           <w:numId w:val="36"/>
         </w:numPr>
-      </w:pPr>
-      <w:r>
+        <w:rPr>
+          <w:lang w:val="en-US"/>
+        </w:rPr>
+      </w:pPr>
+      <w:r>
+        <w:rPr>
+          <w:lang w:val="en-US"/>
+        </w:rPr>
         <w:t>How do the estimated costs of locally hosted LLMs compare with commercial cloud-based LLM services for the investigated use cases?</w:t>
       </w:r>
     </w:p>
@@ -5721,6 +5768,7 @@
           <w:i/>
           <w:iCs/>
           <w:color w:val="000000"/>
+          <w:lang w:val="en-US"/>
         </w:rPr>
       </w:pPr>
     </w:p>
@@ -5731,8 +5779,14 @@
           <w:ilvl w:val="0"/>
           <w:numId w:val="36"/>
         </w:numPr>
-      </w:pPr>
-      <w:r>
+        <w:rPr>
+          <w:lang w:val="en-US"/>
+        </w:rPr>
+      </w:pPr>
+      <w:r>
+        <w:rPr>
+          <w:lang w:val="en-US"/>
+        </w:rPr>
         <w:t>If self-hosted LLMs are technically viable, what hardware investment would be required, and under what expected usage and cost conditions would this investment be financially justified?</w:t>
       </w:r>
     </w:p>
@@ -5743,6 +5797,7 @@
           <w:i/>
           <w:iCs/>
           <w:color w:val="000000"/>
+          <w:lang w:val="en-US"/>
         </w:rPr>
       </w:pPr>
     </w:p>
@@ -5753,16 +5808,28 @@
           <w:ilvl w:val="0"/>
           <w:numId w:val="36"/>
         </w:numPr>
-      </w:pPr>
-      <w:r>
+        <w:rPr>
+          <w:lang w:val="en-US"/>
+        </w:rPr>
+      </w:pPr>
+      <w:r>
+        <w:rPr>
+          <w:lang w:val="en-US"/>
+        </w:rPr>
         <w:t xml:space="preserve">What privacy, ethical, sustainability and future-proofing considerations influence the suitability of locally hosted LLMs within </w:t>
       </w:r>
       <w:proofErr w:type="spellStart"/>
       <w:r>
+        <w:rPr>
+          <w:lang w:val="en-US"/>
+        </w:rPr>
         <w:t>Nahayat's</w:t>
       </w:r>
       <w:proofErr w:type="spellEnd"/>
       <w:r>
+        <w:rPr>
+          <w:lang w:val="en-US"/>
+        </w:rPr>
         <w:t xml:space="preserve"> AI environment?</w:t>
       </w:r>
     </w:p>
@@ -5773,7 +5840,7 @@
           <w:lang w:val="en-GB"/>
         </w:rPr>
       </w:pPr>
-      <w:bookmarkStart w:id="22" w:name="_Toc242267097"/>
+      <w:bookmarkStart w:id="22" w:name="_Toc242238334"/>
       <w:r>
         <w:rPr>
           <w:lang w:val="en-GB"/>
@@ -5794,7 +5861,7 @@
           <w:lang w:val="en-GB"/>
         </w:rPr>
       </w:pPr>
-      <w:bookmarkStart w:id="23" w:name="_Toc242267098"/>
+      <w:bookmarkStart w:id="23" w:name="_Toc242238335"/>
       <w:r>
         <w:rPr>
           <w:lang w:val="en-GB"/>
@@ -5990,7 +6057,7 @@
       <w:bookmarkStart w:id="25" w:name="_Toc327581604"/>
       <w:bookmarkStart w:id="26" w:name="_Toc327583384"/>
       <w:bookmarkStart w:id="27" w:name="_Toc339966123"/>
-      <w:bookmarkStart w:id="28" w:name="_Toc242267099"/>
+      <w:bookmarkStart w:id="28" w:name="_Toc242238336"/>
       <w:r>
         <w:rPr>
           <w:lang w:val="en-GB"/>
@@ -6499,13 +6566,13 @@
       <w:pPr>
         <w:pStyle w:val="Heading2"/>
         <w:rPr>
-          <w:lang w:val="en-NL"/>
-        </w:rPr>
-      </w:pPr>
-      <w:bookmarkStart w:id="29" w:name="_Toc242267100"/>
-      <w:r>
-        <w:rPr>
-          <w:lang w:val="en-NL"/>
+          <w:lang/>
+        </w:rPr>
+      </w:pPr>
+      <w:bookmarkStart w:id="29" w:name="_Toc242238337"/>
+      <w:r>
+        <w:rPr>
+          <w:lang/>
         </w:rPr>
         <w:lastRenderedPageBreak/>
         <w:t>Learning Outcomes</w:t>
@@ -6517,7 +6584,7 @@
         <w:rPr>
           <w:sz w:val="24"/>
           <w:szCs w:val="24"/>
-          <w:lang w:val="en-NL"/>
+          <w:lang/>
         </w:rPr>
       </w:pPr>
       <w:r>
@@ -6526,7 +6593,7 @@
           <w:bCs/>
           <w:sz w:val="24"/>
           <w:szCs w:val="24"/>
-          <w:lang w:val="en-NL"/>
+          <w:lang/>
         </w:rPr>
         <w:t>Learning Outcome 1 – Professional Duties</w:t>
       </w:r>
@@ -6534,7 +6601,7 @@
         <w:rPr>
           <w:sz w:val="24"/>
           <w:szCs w:val="24"/>
-          <w:lang w:val="en-NL"/>
+          <w:lang/>
         </w:rPr>
         <w:br/>
         <w:t>The project will demonstrate professional IT activities through analysis, advice, design, realization and management/control. Evidence will include the current AI environment and stakeholder analysis, research and benchmark documentation, local LLM prototypes and integrations, validation results, hardware and financial analyses, and the final advice report.</w:t>
@@ -6545,7 +6612,7 @@
         <w:rPr>
           <w:sz w:val="24"/>
           <w:szCs w:val="24"/>
-          <w:lang w:val="en-NL"/>
+          <w:lang/>
         </w:rPr>
       </w:pPr>
       <w:r>
@@ -6554,7 +6621,7 @@
           <w:bCs/>
           <w:sz w:val="24"/>
           <w:szCs w:val="24"/>
-          <w:lang w:val="en-NL"/>
+          <w:lang/>
         </w:rPr>
         <w:t>Learning Outcome 2 – Situation Orientation</w:t>
       </w:r>
@@ -6562,36 +6629,18 @@
         <w:rPr>
           <w:sz w:val="24"/>
           <w:szCs w:val="24"/>
-          <w:lang w:val="en-NL"/>
+          <w:lang/>
         </w:rPr>
         <w:br/>
-        <w:t xml:space="preserve">The project is carried out within </w:t>
-      </w:r>
-      <w:proofErr w:type="spellStart"/>
-      <w:r>
-        <w:rPr>
-          <w:sz w:val="24"/>
-          <w:szCs w:val="24"/>
-          <w:lang w:val="en-NL"/>
-        </w:rPr>
-        <w:t>Nahayat's</w:t>
-      </w:r>
-      <w:proofErr w:type="spellEnd"/>
-      <w:r>
-        <w:rPr>
-          <w:sz w:val="24"/>
-          <w:szCs w:val="24"/>
-          <w:lang w:val="en-NL"/>
-        </w:rPr>
-        <w:t xml:space="preserve"> existing AI environment and requires previously acquired IT knowledge to be applied in a new technical and organizational context. Evidence will include adaptation to available hardware and company systems, use of company-specific tools and workflows, Jira planning, technical experimentation and documented adjustments to project decisions based on new findings.</w:t>
-      </w:r>
-    </w:p>
-    <w:p>
-      <w:pPr>
-        <w:rPr>
-          <w:sz w:val="24"/>
-          <w:szCs w:val="24"/>
-          <w:lang w:val="en-NL"/>
+        <w:t>The project is carried out within Nahayat's existing AI environment and requires previously acquired IT knowledge to be applied in a new technical and organizational context. Evidence will include adaptation to available hardware and company systems, use of company-specific tools and workflows, Jira planning, technical experimentation and documented adjustments to project decisions based on new findings.</w:t>
+      </w:r>
+    </w:p>
+    <w:p>
+      <w:pPr>
+        <w:rPr>
+          <w:sz w:val="24"/>
+          <w:szCs w:val="24"/>
+          <w:lang/>
         </w:rPr>
       </w:pPr>
       <w:r>
@@ -6600,7 +6649,7 @@
           <w:bCs/>
           <w:sz w:val="24"/>
           <w:szCs w:val="24"/>
-          <w:lang w:val="en-NL"/>
+          <w:lang/>
         </w:rPr>
         <w:t>Learning Outcome 3 – Professional Standard</w:t>
       </w:r>
@@ -6608,7 +6657,7 @@
         <w:rPr>
           <w:sz w:val="24"/>
           <w:szCs w:val="24"/>
-          <w:lang w:val="en-NL"/>
+          <w:lang/>
         </w:rPr>
         <w:br/>
         <w:t>The project applies the DOT research framework to investigate the feasibility of self-hosted LLMs in a complex and uncertain technical environment. Technical, organizational, financial, privacy, ethical and future-oriented considerations will be incorporated into the research and final recommendation. Evidence will include the research report, stakeholder involvement, benchmark results, feasibility analyses and advice report.</w:t>
@@ -6619,7 +6668,7 @@
         <w:rPr>
           <w:sz w:val="24"/>
           <w:szCs w:val="24"/>
-          <w:lang w:val="en-NL"/>
+          <w:lang/>
         </w:rPr>
       </w:pPr>
       <w:r>
@@ -6628,7 +6677,7 @@
           <w:bCs/>
           <w:sz w:val="24"/>
           <w:szCs w:val="24"/>
-          <w:lang w:val="en-NL"/>
+          <w:lang/>
         </w:rPr>
         <w:t>Learning Outcome 4 – Personal Leadership</w:t>
       </w:r>
@@ -6636,7 +6685,7 @@
         <w:rPr>
           <w:sz w:val="24"/>
           <w:szCs w:val="24"/>
-          <w:lang w:val="en-NL"/>
+          <w:lang/>
         </w:rPr>
         <w:br/>
         <w:t>Personal leadership will be demonstrated by independently planning and executing the project, setting development goals, requesting and applying feedback, documenting progress and adapting the approach when technical or organizational challenges occur. Evidence will include Jira/GitHub activity, feedback sessions, personal goals and the final reflection document.</w:t>
@@ -6676,7 +6725,7 @@
       <w:bookmarkStart w:id="31" w:name="_Toc327581605"/>
       <w:bookmarkStart w:id="32" w:name="_Toc327583385"/>
       <w:bookmarkStart w:id="33" w:name="_Toc339966124"/>
-      <w:bookmarkStart w:id="34" w:name="_Toc242267101"/>
+      <w:bookmarkStart w:id="34" w:name="_Toc242238338"/>
       <w:r>
         <w:rPr>
           <w:lang w:val="en-GB"/>
@@ -6702,7 +6751,7 @@
           <w:rFonts w:cs="Arial"/>
           <w:sz w:val="24"/>
           <w:szCs w:val="24"/>
-          <w:lang w:val="en-NL" w:eastAsia="en-NL"/>
+          <w:lang/>
         </w:rPr>
       </w:pPr>
       <w:r>
@@ -6712,7 +6761,7 @@
           <w:bCs/>
           <w:sz w:val="24"/>
           <w:szCs w:val="24"/>
-          <w:lang w:val="en-NL" w:eastAsia="en-NL"/>
+          <w:lang/>
         </w:rPr>
         <w:t>Phase 1 – Orientation and problem analysis</w:t>
       </w:r>
@@ -6721,7 +6770,7 @@
           <w:rFonts w:cs="Arial"/>
           <w:sz w:val="24"/>
           <w:szCs w:val="24"/>
-          <w:lang w:val="en-NL" w:eastAsia="en-NL"/>
+          <w:lang/>
         </w:rPr>
         <w:br/>
         <w:t>Understand the existing AI infrastructure, cloud LLM usage, available hardware, relevant use cases, stakeholder requirements and project constraints. Refine the project scope and research questions.</w:t>
@@ -6734,7 +6783,7 @@
           <w:rFonts w:cs="Arial"/>
           <w:sz w:val="24"/>
           <w:szCs w:val="24"/>
-          <w:lang w:val="en-NL" w:eastAsia="en-NL"/>
+          <w:lang/>
         </w:rPr>
       </w:pPr>
       <w:r>
@@ -6744,7 +6793,7 @@
           <w:bCs/>
           <w:sz w:val="24"/>
           <w:szCs w:val="24"/>
-          <w:lang w:val="en-NL" w:eastAsia="en-NL"/>
+          <w:lang/>
         </w:rPr>
         <w:t>Phase 2 – Technology and model research</w:t>
       </w:r>
@@ -6753,7 +6802,7 @@
           <w:rFonts w:cs="Arial"/>
           <w:sz w:val="24"/>
           <w:szCs w:val="24"/>
-          <w:lang w:val="en-NL" w:eastAsia="en-NL"/>
+          <w:lang/>
         </w:rPr>
         <w:br/>
         <w:t>Investigate suitable self-hosted LLMs, inference frameworks, deployment approaches and hardware requirements. Select promising candidates and representative company use cases for further evaluation.</w:t>
@@ -6766,7 +6815,7 @@
           <w:rFonts w:cs="Arial"/>
           <w:sz w:val="24"/>
           <w:szCs w:val="24"/>
-          <w:lang w:val="en-NL" w:eastAsia="en-NL"/>
+          <w:lang/>
         </w:rPr>
       </w:pPr>
       <w:r>
@@ -6776,7 +6825,7 @@
           <w:bCs/>
           <w:sz w:val="24"/>
           <w:szCs w:val="24"/>
-          <w:lang w:val="en-NL" w:eastAsia="en-NL"/>
+          <w:lang/>
         </w:rPr>
         <w:t>Phase 3 – Prototype and integration</w:t>
       </w:r>
@@ -6785,7 +6834,7 @@
           <w:rFonts w:cs="Arial"/>
           <w:sz w:val="24"/>
           <w:szCs w:val="24"/>
-          <w:lang w:val="en-NL" w:eastAsia="en-NL"/>
+          <w:lang/>
         </w:rPr>
         <w:br/>
         <w:t>Deploy selected self-hosted models and develop the required integrations to test them within representative parts of the company's existing AI ecosystem.</w:t>
@@ -6798,7 +6847,7 @@
           <w:rFonts w:cs="Arial"/>
           <w:sz w:val="24"/>
           <w:szCs w:val="24"/>
-          <w:lang w:val="en-NL" w:eastAsia="en-NL"/>
+          <w:lang/>
         </w:rPr>
       </w:pPr>
       <w:r>
@@ -6808,7 +6857,7 @@
           <w:bCs/>
           <w:sz w:val="24"/>
           <w:szCs w:val="24"/>
-          <w:lang w:val="en-NL" w:eastAsia="en-NL"/>
+          <w:lang/>
         </w:rPr>
         <w:t>Phase 4 – Benchmarking and evaluation</w:t>
       </w:r>
@@ -6817,7 +6866,7 @@
           <w:rFonts w:cs="Arial"/>
           <w:sz w:val="24"/>
           <w:szCs w:val="24"/>
-          <w:lang w:val="en-NL" w:eastAsia="en-NL"/>
+          <w:lang/>
         </w:rPr>
         <w:br/>
         <w:t xml:space="preserve">Evaluate the selected solutions using defined test cases and compare the results with </w:t>
@@ -6827,7 +6876,7 @@
           <w:rFonts w:cs="Arial"/>
           <w:sz w:val="24"/>
           <w:szCs w:val="24"/>
-          <w:lang w:val="en-NL" w:eastAsia="en-NL"/>
+          <w:lang/>
         </w:rPr>
         <w:lastRenderedPageBreak/>
         <w:t>relevant cloud-based models. Analyse model quality, performance, hardware utilization, integration feasibility and other agreed evaluation criteria.</w:t>
@@ -6840,7 +6889,7 @@
           <w:rFonts w:cs="Arial"/>
           <w:sz w:val="24"/>
           <w:szCs w:val="24"/>
-          <w:lang w:val="en-NL" w:eastAsia="en-NL"/>
+          <w:lang/>
         </w:rPr>
       </w:pPr>
       <w:r>
@@ -6850,7 +6899,7 @@
           <w:bCs/>
           <w:sz w:val="24"/>
           <w:szCs w:val="24"/>
-          <w:lang w:val="en-NL" w:eastAsia="en-NL"/>
+          <w:lang/>
         </w:rPr>
         <w:t>Phase 5 – Refinement and validation</w:t>
       </w:r>
@@ -6859,7 +6908,7 @@
           <w:rFonts w:cs="Arial"/>
           <w:sz w:val="24"/>
           <w:szCs w:val="24"/>
-          <w:lang w:val="en-NL" w:eastAsia="en-NL"/>
+          <w:lang/>
         </w:rPr>
         <w:br/>
         <w:t>Improve or adjust the prototypes and experiments based on previous findings. Validate important results and recommendations together with relevant company stakeholders.</w:t>
@@ -6872,7 +6921,7 @@
           <w:rFonts w:cs="Arial"/>
           <w:sz w:val="24"/>
           <w:szCs w:val="24"/>
-          <w:lang w:val="en-NL" w:eastAsia="en-NL"/>
+          <w:lang/>
         </w:rPr>
       </w:pPr>
       <w:r>
@@ -6882,7 +6931,7 @@
           <w:bCs/>
           <w:sz w:val="24"/>
           <w:szCs w:val="24"/>
-          <w:lang w:val="en-NL" w:eastAsia="en-NL"/>
+          <w:lang/>
         </w:rPr>
         <w:t>Phase 6 – Conclusion and completion</w:t>
       </w:r>
@@ -6891,7 +6940,7 @@
           <w:rFonts w:cs="Arial"/>
           <w:sz w:val="24"/>
           <w:szCs w:val="24"/>
-          <w:lang w:val="en-NL" w:eastAsia="en-NL"/>
+          <w:lang/>
         </w:rPr>
         <w:br/>
         <w:t>Determine which workloads are suitable for self-hosted inference, which should remain cloud-based and where a hybrid approach is preferable. Finalize recommendations regarding hardware requirements, complete documentation and portfolio evidence, and transfer the project results to the company.</w:t>
@@ -7673,7 +7722,7 @@
       <w:bookmarkStart w:id="43" w:name="_Toc327581600"/>
       <w:bookmarkStart w:id="44" w:name="_Toc327583380"/>
       <w:bookmarkStart w:id="45" w:name="_Toc339966119"/>
-      <w:bookmarkStart w:id="46" w:name="_Toc242267102"/>
+      <w:bookmarkStart w:id="46" w:name="_Toc242238339"/>
       <w:bookmarkEnd w:id="35"/>
       <w:bookmarkEnd w:id="36"/>
       <w:bookmarkEnd w:id="37"/>
@@ -7734,7 +7783,7 @@
       <w:bookmarkStart w:id="49" w:name="_Toc327583381"/>
       <w:bookmarkStart w:id="50" w:name="_Toc339966120"/>
       <w:bookmarkStart w:id="51" w:name="_Toc480254627"/>
-      <w:bookmarkStart w:id="52" w:name="_Toc242267103"/>
+      <w:bookmarkStart w:id="52" w:name="_Toc242238340"/>
       <w:r>
         <w:rPr>
           <w:lang w:val="en-GB"/>
@@ -8018,13 +8067,43 @@
                 <w:szCs w:val="18"/>
               </w:rPr>
             </w:pPr>
+            <w:proofErr w:type="spellStart"/>
             <w:r>
               <w:rPr>
                 <w:rFonts w:cs="Arial"/>
                 <w:color w:val="000000"/>
                 <w:szCs w:val="18"/>
               </w:rPr>
-              <w:t>Thayyakathe Raveendran,Sreedevi S.</w:t>
+              <w:t>Thayyakathe</w:t>
+            </w:r>
+            <w:proofErr w:type="spellEnd"/>
+            <w:r>
+              <w:rPr>
+                <w:rFonts w:cs="Arial"/>
+                <w:color w:val="000000"/>
+                <w:szCs w:val="18"/>
+              </w:rPr>
+              <w:t xml:space="preserve"> </w:t>
+            </w:r>
+            <w:proofErr w:type="spellStart"/>
+            <w:proofErr w:type="gramStart"/>
+            <w:r>
+              <w:rPr>
+                <w:rFonts w:cs="Arial"/>
+                <w:color w:val="000000"/>
+                <w:szCs w:val="18"/>
+              </w:rPr>
+              <w:t>Raveendran,Sreedevi</w:t>
+            </w:r>
+            <w:proofErr w:type="spellEnd"/>
+            <w:proofErr w:type="gramEnd"/>
+            <w:r>
+              <w:rPr>
+                <w:rFonts w:cs="Arial"/>
+                <w:color w:val="000000"/>
+                <w:szCs w:val="18"/>
+              </w:rPr>
+              <w:t xml:space="preserve"> S.</w:t>
             </w:r>
           </w:p>
           <w:p>
@@ -8322,7 +8401,7 @@
           <w:lang w:val="en-GB"/>
         </w:rPr>
       </w:pPr>
-      <w:bookmarkStart w:id="53" w:name="_Toc242267104"/>
+      <w:bookmarkStart w:id="53" w:name="_Toc242238341"/>
       <w:r>
         <w:rPr>
           <w:lang w:val="en-GB"/>
@@ -8405,7 +8484,7 @@
       <w:bookmarkStart w:id="55" w:name="_Toc327581612"/>
       <w:bookmarkStart w:id="56" w:name="_Toc327583392"/>
       <w:bookmarkStart w:id="57" w:name="_Toc339966131"/>
-      <w:bookmarkStart w:id="58" w:name="_Toc242267105"/>
+      <w:bookmarkStart w:id="58" w:name="_Toc242238342"/>
       <w:r>
         <w:rPr>
           <w:lang w:val="en-GB"/>
@@ -8616,7 +8695,7 @@
           <w:lang w:val="en-GB"/>
         </w:rPr>
       </w:pPr>
-      <w:bookmarkStart w:id="59" w:name="_Toc242267106"/>
+      <w:bookmarkStart w:id="59" w:name="_Toc242238343"/>
       <w:bookmarkEnd w:id="54"/>
       <w:bookmarkEnd w:id="55"/>
       <w:bookmarkEnd w:id="56"/>
@@ -8730,7 +8809,7 @@
       <w:bookmarkStart w:id="61" w:name="_Toc327581614"/>
       <w:bookmarkStart w:id="62" w:name="_Toc327583394"/>
       <w:bookmarkStart w:id="63" w:name="_Toc339966133"/>
-      <w:bookmarkStart w:id="64" w:name="_Toc242267107"/>
+      <w:bookmarkStart w:id="64" w:name="_Toc242238344"/>
       <w:r>
         <w:rPr>
           <w:lang w:val="en-GB"/>
@@ -8773,7 +8852,7 @@
           <w:lang w:val="en-GB"/>
         </w:rPr>
       </w:pPr>
-      <w:bookmarkStart w:id="65" w:name="_Toc242267108"/>
+      <w:bookmarkStart w:id="65" w:name="_Toc242238345"/>
       <w:r>
         <w:rPr>
           <w:lang w:val="en-GB"/>
@@ -8913,7 +8992,7 @@
           <w:lang w:val="en-GB"/>
         </w:rPr>
       </w:pPr>
-      <w:bookmarkStart w:id="69" w:name="_Toc242267109"/>
+      <w:bookmarkStart w:id="69" w:name="_Toc242238346"/>
       <w:bookmarkEnd w:id="66"/>
       <w:bookmarkEnd w:id="67"/>
       <w:bookmarkEnd w:id="68"/>
@@ -9347,7 +9426,7 @@
           <w:lang w:val="en-GB"/>
         </w:rPr>
       </w:pPr>
-      <w:bookmarkStart w:id="70" w:name="_Toc242267110"/>
+      <w:bookmarkStart w:id="70" w:name="_Toc242238347"/>
       <w:r>
         <w:rPr>
           <w:lang w:val="en-GB"/>
@@ -9560,7 +9639,7 @@
       <w:pPr>
         <w:pStyle w:val="Heading2"/>
       </w:pPr>
-      <w:bookmarkStart w:id="71" w:name="_Toc242267111"/>
+      <w:bookmarkStart w:id="71" w:name="_Toc242238348"/>
       <w:r>
         <w:t>Glossary and Acronyms</w:t>
       </w:r>
@@ -9634,7 +9713,7 @@
                       <w:rFonts w:ascii="Times New Roman" w:hAnsi="Times New Roman"/>
                       <w:sz w:val="24"/>
                       <w:szCs w:val="24"/>
-                      <w:lang w:val="en-NL" w:eastAsia="en-NL"/>
+                      <w:lang/>
                     </w:rPr>
                   </w:pPr>
                 </w:p>
@@ -9654,7 +9733,7 @@
                       <w:bCs/>
                       <w:sz w:val="24"/>
                       <w:szCs w:val="24"/>
-                      <w:lang w:val="en-NL" w:eastAsia="en-NL"/>
+                      <w:lang/>
                     </w:rPr>
                   </w:pPr>
                   <w:r>
@@ -9664,7 +9743,7 @@
                       <w:bCs/>
                       <w:sz w:val="24"/>
                       <w:szCs w:val="24"/>
-                      <w:lang w:val="en-NL" w:eastAsia="en-NL"/>
+                      <w:lang/>
                     </w:rPr>
                     <w:t>Meaning</w:t>
                   </w:r>
@@ -10160,13 +10239,33 @@
       </w:rPr>
       <w:t xml:space="preserve">Documentnaam: </w:t>
     </w:r>
+    <w:proofErr w:type="spellStart"/>
     <w:r>
       <w:rPr>
         <w:color w:val="82838A"/>
         <w:sz w:val="16"/>
         <w:szCs w:val="16"/>
       </w:rPr>
-      <w:t xml:space="preserve">ProjectPlan-M.Constantin </w:t>
+      <w:t>ProjectPlan-</w:t>
+    </w:r>
+    <w:proofErr w:type="gramStart"/>
+    <w:r>
+      <w:rPr>
+        <w:color w:val="82838A"/>
+        <w:sz w:val="16"/>
+        <w:szCs w:val="16"/>
+      </w:rPr>
+      <w:t>M.Constantin</w:t>
+    </w:r>
+    <w:proofErr w:type="spellEnd"/>
+    <w:proofErr w:type="gramEnd"/>
+    <w:r>
+      <w:rPr>
+        <w:color w:val="82838A"/>
+        <w:sz w:val="16"/>
+        <w:szCs w:val="16"/>
+      </w:rPr>
+      <w:t xml:space="preserve"> </w:t>
     </w:r>
     <w:r>
       <w:rPr>
@@ -12531,6 +12630,7 @@
   <w:style w:type="character" w:default="1" w:styleId="DefaultParagraphFont">
     <w:name w:val="Default Paragraph Font"/>
     <w:uiPriority w:val="1"/>
+    <w:semiHidden/>
     <w:unhideWhenUsed/>
   </w:style>
   <w:style w:type="table" w:default="1" w:styleId="TableNormal">
@@ -12949,7 +13049,7 @@
       <w:rFonts w:ascii="Times New Roman" w:hAnsi="Times New Roman"/>
       <w:sz w:val="24"/>
       <w:szCs w:val="24"/>
-      <w:lang w:val="en-NL" w:eastAsia="en-NL"/>
+      <w:lang/>
     </w:rPr>
   </w:style>
   <w:style w:type="character" w:styleId="Strong">
@@ -13298,9 +13398,12 @@
 </file>
 
 <file path=customXml/item1.xml><?xml version="1.0" encoding="utf-8"?>
-<p:properties xmlns:p="http://schemas.microsoft.com/office/2006/metadata/properties" xmlns:xsi="http://www.w3.org/2001/XMLSchema-instance" xmlns:pc="http://schemas.microsoft.com/office/infopath/2007/PartnerControls">
-  <documentManagement/>
-</p:properties>
+<?mso-contentType ?>
+<FormTemplates xmlns="http://schemas.microsoft.com/sharepoint/v3/contenttype/forms">
+  <Display>DocumentLibraryForm</Display>
+  <Edit>DocumentLibraryForm</Edit>
+  <New>DocumentLibraryForm</New>
+</FormTemplates>
 </file>
 
 <file path=customXml/item2.xml><?xml version="1.0" encoding="utf-8"?>
@@ -13418,19 +13521,15 @@
 </file>
 
 <file path=customXml/item3.xml><?xml version="1.0" encoding="utf-8"?>
-<?mso-contentType ?>
-<FormTemplates xmlns="http://schemas.microsoft.com/sharepoint/v3/contenttype/forms">
-  <Display>DocumentLibraryForm</Display>
-  <Edit>DocumentLibraryForm</Edit>
-  <New>DocumentLibraryForm</New>
-</FormTemplates>
+<p:properties xmlns:p="http://schemas.microsoft.com/office/2006/metadata/properties" xmlns:xsi="http://www.w3.org/2001/XMLSchema-instance" xmlns:pc="http://schemas.microsoft.com/office/infopath/2007/PartnerControls">
+  <documentManagement/>
+</p:properties>
 </file>
 
 <file path=customXml/itemProps1.xml><?xml version="1.0" encoding="utf-8"?>
-<ds:datastoreItem xmlns:ds="http://schemas.openxmlformats.org/officeDocument/2006/customXml" ds:itemID="{AC94A26D-82EB-45B7-AEA3-129FBDD1FCEB}">
+<ds:datastoreItem xmlns:ds="http://schemas.openxmlformats.org/officeDocument/2006/customXml" ds:itemID="{8D559B33-4825-405B-ACEB-6F229225D325}">
   <ds:schemaRefs>
-    <ds:schemaRef ds:uri="http://schemas.microsoft.com/office/2006/metadata/properties"/>
-    <ds:schemaRef ds:uri="http://schemas.microsoft.com/office/infopath/2007/PartnerControls"/>
+    <ds:schemaRef ds:uri="http://schemas.microsoft.com/sharepoint/v3/contenttype/forms"/>
   </ds:schemaRefs>
 </ds:datastoreItem>
 </file>
@@ -13452,9 +13551,10 @@
 </file>
 
 <file path=customXml/itemProps3.xml><?xml version="1.0" encoding="utf-8"?>
-<ds:datastoreItem xmlns:ds="http://schemas.openxmlformats.org/officeDocument/2006/customXml" ds:itemID="{8D559B33-4825-405B-ACEB-6F229225D325}">
+<ds:datastoreItem xmlns:ds="http://schemas.openxmlformats.org/officeDocument/2006/customXml" ds:itemID="{AC94A26D-82EB-45B7-AEA3-129FBDD1FCEB}">
   <ds:schemaRefs>
-    <ds:schemaRef ds:uri="http://schemas.microsoft.com/sharepoint/v3/contenttype/forms"/>
+    <ds:schemaRef ds:uri="http://schemas.microsoft.com/office/2006/metadata/properties"/>
+    <ds:schemaRef ds:uri="http://schemas.microsoft.com/office/infopath/2007/PartnerControls"/>
   </ds:schemaRefs>
 </ds:datastoreItem>
 </file>
</xml_diff>